<commit_message>
feat: add Pipeline H (Document Ingestion & Evidence Engine) and purge hallucinated contracts/bills for teatek-spa
</commit_message>
<xml_diff>
--- a/clients/teatek-spa/quotes/prev-2026-001.docx
+++ b/clients/teatek-spa/quotes/prev-2026-001.docx
@@ -76,10 +76,6 @@
             </w:r>
             <w:r>
               <w:t>T.E.A. TEK S.P.A.</w:t>
-              <w:br/>
-            </w:r>
-            <w:r>
-              <w:t>C.a.: Felice Granisso</w:t>
               <w:br/>
             </w:r>
             <w:r>
@@ -196,7 +192,7 @@
               <w:rPr>
                 <w:sz w:val="18"/>
               </w:rPr>
-              <w:t>JMC-14DI-224N</w:t>
+              <w:t>SRV-OPENSTOR-2U</w:t>
             </w:r>
           </w:p>
         </w:tc>
@@ -209,7 +205,7 @@
               <w:rPr>
                 <w:sz w:val="18"/>
               </w:rPr>
-              <w:t>OpenStor JovianDSS 2U Rack Storage 24 Bay 2.5'' Full NVMe Dual Intel Xeon 6 (2x100GbE QSFP28 Metro Cluster Sync, 2x1GbE, Redundant 2000W PSU Titanium)</w:t>
+              <w:t>2U ZFS OpenStor JovianDSS Rack Storage (iSCSI/NFS/SMB/FC) 24 Bay 2.5" NVMe - DUAL INTEL XEON 6 -</w:t>
             </w:r>
           </w:p>
         </w:tc>
@@ -235,7 +231,7 @@
               <w:rPr>
                 <w:sz w:val="18"/>
               </w:rPr>
-              <w:t>€ 10900.00</w:t>
+              <w:t>€ 16691.69</w:t>
             </w:r>
           </w:p>
         </w:tc>
@@ -248,7 +244,7 @@
               <w:rPr>
                 <w:sz w:val="18"/>
               </w:rPr>
-              <w:t>€ 21800.00</w:t>
+              <w:t>€ 33383.38</w:t>
             </w:r>
           </w:p>
         </w:tc>
@@ -276,7 +272,7 @@
               <w:rPr>
                 <w:sz w:val="18"/>
               </w:rPr>
-              <w:t>Intel Xeon 6507P (8C/16T, min 3.50GHz - max 4.30GHz, 48M Cache, LGA4710, TDP 150W)</w:t>
+              <w:t>CPU / SERVER - 6507P- (Xeon® 8C/16T) - min 3,50GHz -max 4,30GHz - 48M Cache - LGA4710 - TDP: 150W - MAX memoria 4TB</w:t>
             </w:r>
           </w:p>
         </w:tc>
@@ -302,7 +298,7 @@
               <w:rPr>
                 <w:sz w:val="18"/>
               </w:rPr>
-              <w:t>€ 1250.00</w:t>
+              <w:t>€ 2532.53</w:t>
             </w:r>
           </w:p>
         </w:tc>
@@ -315,7 +311,7 @@
               <w:rPr>
                 <w:sz w:val="18"/>
               </w:rPr>
-              <w:t>€ 5000.00</w:t>
+              <w:t>€ 10130.12</w:t>
             </w:r>
           </w:p>
         </w:tc>
@@ -330,7 +326,7 @@
               <w:rPr>
                 <w:sz w:val="18"/>
               </w:rPr>
-              <w:t>RAM-32GB-D5</w:t>
+              <w:t>RAM-32GB-DDR5</w:t>
             </w:r>
           </w:p>
         </w:tc>
@@ -343,7 +339,7 @@
               <w:rPr>
                 <w:sz w:val="18"/>
               </w:rPr>
-              <w:t>Memoria 32GB DDR5-5600 ECC Registered (Configurazione totale 512GB RAM)</w:t>
+              <w:t>Memoria 32GB DDR5-5600 ECC REG</w:t>
             </w:r>
           </w:p>
         </w:tc>
@@ -369,7 +365,7 @@
               <w:rPr>
                 <w:sz w:val="18"/>
               </w:rPr>
-              <w:t>€ 250.00</w:t>
+              <w:t>€ 241.74</w:t>
             </w:r>
           </w:p>
         </w:tc>
@@ -382,7 +378,7 @@
               <w:rPr>
                 <w:sz w:val="18"/>
               </w:rPr>
-              <w:t>€ 4000.00</w:t>
+              <w:t>€ 3867.84</w:t>
             </w:r>
           </w:p>
         </w:tc>
@@ -397,7 +393,7 @@
               <w:rPr>
                 <w:sz w:val="18"/>
               </w:rPr>
-              <w:t>KIOXIA-CM7V-3.2TB</w:t>
+              <w:t>SSD-KIOXIA-3200GB</w:t>
             </w:r>
           </w:p>
         </w:tc>
@@ -410,7 +406,7 @@
               <w:rPr>
                 <w:sz w:val="18"/>
               </w:rPr>
-              <w:t>Kioxia CM7-V U.3 15mm 3.2TB SIE 3 DWPD PCIe Gen5 1x4, 2x2 Mix Use (ZIL Write Log Cache)</w:t>
+              <w:t>Kioxia CM7-V U.3 15mm 3200 GB. SIE 3 DWPD PCIe Gen5 1x4, 2x2 Mix Use - Max KIOPs: 2.700K/600K</w:t>
             </w:r>
           </w:p>
         </w:tc>
@@ -436,7 +432,7 @@
               <w:rPr>
                 <w:sz w:val="18"/>
               </w:rPr>
-              <w:t>€ 1350.00</w:t>
+              <w:t>€ 1381.38</w:t>
             </w:r>
           </w:p>
         </w:tc>
@@ -449,7 +445,7 @@
               <w:rPr>
                 <w:sz w:val="18"/>
               </w:rPr>
-              <w:t>€ 2700.00</w:t>
+              <w:t>€ 2762.76</w:t>
             </w:r>
           </w:p>
         </w:tc>
@@ -464,7 +460,7 @@
               <w:rPr>
                 <w:sz w:val="18"/>
               </w:rPr>
-              <w:t>SAMSUNG-PM9A3-3.8TB</w:t>
+              <w:t>SSD-NVME-3840GB</w:t>
             </w:r>
           </w:p>
         </w:tc>
@@ -477,7 +473,7 @@
               <w:rPr>
                 <w:sz w:val="18"/>
               </w:rPr>
-              <w:t>Samsung PM9A3 3.84TB NVMe PCIe 4.0 x4 U.2 7mm Enterprise 1DWPD SED Opal (76.8TB Raw Storage)</w:t>
+              <w:t>Samsung PM9A3 3.8TB NVMe PCIe4x4 U.2 7mm 1DWPD 5YR SED Opal, Max KIOPs: 1000K/180K (Read/Write),</w:t>
             </w:r>
           </w:p>
         </w:tc>
@@ -503,7 +499,7 @@
               <w:rPr>
                 <w:sz w:val="18"/>
               </w:rPr>
-              <w:t>€ 680.00</w:t>
+              <w:t>€ 667.67</w:t>
             </w:r>
           </w:p>
         </w:tc>
@@ -516,239 +512,7 @@
               <w:rPr>
                 <w:sz w:val="18"/>
               </w:rPr>
-              <w:t>€ 13600.00</w:t>
-            </w:r>
-          </w:p>
-        </w:tc>
-      </w:tr>
-      <w:tr>
-        <w:tc>
-          <w:tcPr>
-            <w:tcW w:type="dxa" w:w="1987"/>
-          </w:tcPr>
-          <w:p>
-            <w:r>
-              <w:rPr>
-                <w:sz w:val="18"/>
-              </w:rPr>
-              <w:t>SFP-FINISAR-10G</w:t>
-            </w:r>
-          </w:p>
-        </w:tc>
-        <w:tc>
-          <w:tcPr>
-            <w:tcW w:type="dxa" w:w="1987"/>
-          </w:tcPr>
-          <w:p>
-            <w:r>
-              <w:rPr>
-                <w:sz w:val="18"/>
-              </w:rPr>
-              <w:t>Finisar FTLX8574D3BCV 1G/10G Dual-Rate SFP+ Short Range Transceiver (10G Eth)</w:t>
-            </w:r>
-          </w:p>
-        </w:tc>
-        <w:tc>
-          <w:tcPr>
-            <w:tcW w:type="dxa" w:w="1987"/>
-          </w:tcPr>
-          <w:p>
-            <w:r>
-              <w:rPr>
-                <w:sz w:val="18"/>
-              </w:rPr>
-              <w:t>2</w:t>
-            </w:r>
-          </w:p>
-        </w:tc>
-        <w:tc>
-          <w:tcPr>
-            <w:tcW w:type="dxa" w:w="1987"/>
-          </w:tcPr>
-          <w:p>
-            <w:r>
-              <w:rPr>
-                <w:sz w:val="18"/>
-              </w:rPr>
-              <w:t>€ 110.00</w:t>
-            </w:r>
-          </w:p>
-        </w:tc>
-        <w:tc>
-          <w:tcPr>
-            <w:tcW w:type="dxa" w:w="1987"/>
-          </w:tcPr>
-          <w:p>
-            <w:r>
-              <w:rPr>
-                <w:sz w:val="18"/>
-              </w:rPr>
-              <w:t>€ 220.00</w:t>
-            </w:r>
-          </w:p>
-        </w:tc>
-      </w:tr>
-    </w:tbl>
-    <w:p/>
-    <w:p>
-      <w:pPr>
-        <w:pStyle w:val="Heading2"/>
-      </w:pPr>
-      <w:r>
-        <w:rPr>
-          <w:color w:val="2563EB"/>
-        </w:rPr>
-        <w:t>Software Licenses</w:t>
-      </w:r>
-    </w:p>
-    <w:tbl>
-      <w:tblPr>
-        <w:tblW w:type="auto" w:w="0"/>
-        <w:jc w:val="center"/>
-        <w:tblLook w:firstColumn="1" w:firstRow="1" w:lastColumn="0" w:lastRow="0" w:noHBand="0" w:noVBand="1" w:val="04A0"/>
-      </w:tblPr>
-      <w:tblGrid>
-        <w:gridCol w:w="1987"/>
-        <w:gridCol w:w="1987"/>
-        <w:gridCol w:w="1987"/>
-        <w:gridCol w:w="1987"/>
-        <w:gridCol w:w="1987"/>
-      </w:tblGrid>
-      <w:tr>
-        <w:tc>
-          <w:tcPr>
-            <w:tcW w:type="dxa" w:w="1987"/>
-          </w:tcPr>
-          <w:p>
-            <w:r>
-              <w:rPr>
-                <w:b/>
-                <w:sz w:val="19"/>
-              </w:rPr>
-              <w:t>Codice</w:t>
-            </w:r>
-          </w:p>
-        </w:tc>
-        <w:tc>
-          <w:tcPr>
-            <w:tcW w:type="dxa" w:w="1987"/>
-          </w:tcPr>
-          <w:p>
-            <w:r>
-              <w:rPr>
-                <w:b/>
-                <w:sz w:val="19"/>
-              </w:rPr>
-              <w:t>Descrizione</w:t>
-            </w:r>
-          </w:p>
-        </w:tc>
-        <w:tc>
-          <w:tcPr>
-            <w:tcW w:type="dxa" w:w="1987"/>
-          </w:tcPr>
-          <w:p>
-            <w:r>
-              <w:rPr>
-                <w:b/>
-                <w:sz w:val="19"/>
-              </w:rPr>
-              <w:t>Q.tà</w:t>
-            </w:r>
-          </w:p>
-        </w:tc>
-        <w:tc>
-          <w:tcPr>
-            <w:tcW w:type="dxa" w:w="1987"/>
-          </w:tcPr>
-          <w:p>
-            <w:r>
-              <w:rPr>
-                <w:b/>
-                <w:sz w:val="19"/>
-              </w:rPr>
-              <w:t>Prezzo Unit.</w:t>
-            </w:r>
-          </w:p>
-        </w:tc>
-        <w:tc>
-          <w:tcPr>
-            <w:tcW w:type="dxa" w:w="1987"/>
-          </w:tcPr>
-          <w:p>
-            <w:r>
-              <w:rPr>
-                <w:b/>
-                <w:sz w:val="19"/>
-              </w:rPr>
-              <w:t>Totale Netto</w:t>
-            </w:r>
-          </w:p>
-        </w:tc>
-      </w:tr>
-      <w:tr>
-        <w:tc>
-          <w:tcPr>
-            <w:tcW w:type="dxa" w:w="1987"/>
-          </w:tcPr>
-          <w:p>
-            <w:r>
-              <w:rPr>
-                <w:sz w:val="18"/>
-              </w:rPr>
-              <w:t>LIC-JOVIAN-32TB</w:t>
-            </w:r>
-          </w:p>
-        </w:tc>
-        <w:tc>
-          <w:tcPr>
-            <w:tcW w:type="dxa" w:w="1987"/>
-          </w:tcPr>
-          <w:p>
-            <w:r>
-              <w:rPr>
-                <w:sz w:val="18"/>
-              </w:rPr>
-              <w:t>Open-E JovianDSS Storage Extension 32TB License Key &amp; HA Metro Cluster Active/Active License Included</w:t>
-            </w:r>
-          </w:p>
-        </w:tc>
-        <w:tc>
-          <w:tcPr>
-            <w:tcW w:type="dxa" w:w="1987"/>
-          </w:tcPr>
-          <w:p>
-            <w:r>
-              <w:rPr>
-                <w:sz w:val="18"/>
-              </w:rPr>
-              <w:t>2</w:t>
-            </w:r>
-          </w:p>
-        </w:tc>
-        <w:tc>
-          <w:tcPr>
-            <w:tcW w:type="dxa" w:w="1987"/>
-          </w:tcPr>
-          <w:p>
-            <w:r>
-              <w:rPr>
-                <w:sz w:val="18"/>
-              </w:rPr>
-              <w:t>€ 4400.00</w:t>
-            </w:r>
-          </w:p>
-        </w:tc>
-        <w:tc>
-          <w:tcPr>
-            <w:tcW w:type="dxa" w:w="1987"/>
-          </w:tcPr>
-          <w:p>
-            <w:r>
-              <w:rPr>
-                <w:sz w:val="18"/>
-              </w:rPr>
-              <w:t>€ 8800.00</w:t>
+              <w:t>€ 13353.40</w:t>
             </w:r>
           </w:p>
         </w:tc>
@@ -861,7 +625,7 @@
               <w:rPr>
                 <w:sz w:val="18"/>
               </w:rPr>
-              <w:t>SUP-JOVIAN-3Y</w:t>
+              <w:t>OPT-WARRANTY-ONSITE</w:t>
             </w:r>
           </w:p>
         </w:tc>
@@ -874,74 +638,7 @@
               <w:rPr>
                 <w:sz w:val="18"/>
               </w:rPr>
-              <w:t>JovianDSS Premium Support 3 Anni (Tier 20 to 128TB fornito da Share Dist)</w:t>
-            </w:r>
-          </w:p>
-        </w:tc>
-        <w:tc>
-          <w:tcPr>
-            <w:tcW w:type="dxa" w:w="1987"/>
-          </w:tcPr>
-          <w:p>
-            <w:r>
-              <w:rPr>
-                <w:sz w:val="18"/>
-              </w:rPr>
-              <w:t>2</w:t>
-            </w:r>
-          </w:p>
-        </w:tc>
-        <w:tc>
-          <w:tcPr>
-            <w:tcW w:type="dxa" w:w="1987"/>
-          </w:tcPr>
-          <w:p>
-            <w:r>
-              <w:rPr>
-                <w:sz w:val="18"/>
-              </w:rPr>
-              <w:t>€ 3000.00</w:t>
-            </w:r>
-          </w:p>
-        </w:tc>
-        <w:tc>
-          <w:tcPr>
-            <w:tcW w:type="dxa" w:w="1987"/>
-          </w:tcPr>
-          <w:p>
-            <w:r>
-              <w:rPr>
-                <w:sz w:val="18"/>
-              </w:rPr>
-              <w:t>€ 6000.00</w:t>
-            </w:r>
-          </w:p>
-        </w:tc>
-      </w:tr>
-      <w:tr>
-        <w:tc>
-          <w:tcPr>
-            <w:tcW w:type="dxa" w:w="1987"/>
-          </w:tcPr>
-          <w:p>
-            <w:r>
-              <w:rPr>
-                <w:sz w:val="18"/>
-              </w:rPr>
-              <w:t>SRV-CLUSTER-SETUP</w:t>
-            </w:r>
-          </w:p>
-        </w:tc>
-        <w:tc>
-          <w:tcPr>
-            <w:tcW w:type="dxa" w:w="1987"/>
-          </w:tcPr>
-          <w:p>
-            <w:r>
-              <w:rPr>
-                <w:sz w:val="18"/>
-              </w:rPr>
-              <w:t>Servizio Professionale On-Site: Installazione Rack, Cablaggio 100GbE Sync, Configurazione ZFS HA Metro Cluster, Tuning VMware ESXi e Collaudo Failover</w:t>
+              <w:t>Estensione a 3 / 5 anni ON-SITE opzionale  [OPZIONE]</w:t>
             </w:r>
           </w:p>
         </w:tc>
@@ -967,7 +664,7 @@
               <w:rPr>
                 <w:sz w:val="18"/>
               </w:rPr>
-              <w:t>€ 3880.00</w:t>
+              <w:t>€ 0.00</w:t>
             </w:r>
           </w:p>
         </w:tc>
@@ -980,7 +677,7 @@
               <w:rPr>
                 <w:sz w:val="18"/>
               </w:rPr>
-              <w:t>€ 3880.00</w:t>
+              <w:t>€ 0.00</w:t>
             </w:r>
           </w:p>
         </w:tc>
@@ -995,7 +692,7 @@
               <w:rPr>
                 <w:sz w:val="18"/>
               </w:rPr>
-              <w:t>OPT-GARANZIA-NBD-3Y</w:t>
+              <w:t>SRV-SETUP-METROCLUSTER</w:t>
             </w:r>
           </w:p>
         </w:tc>
@@ -1008,7 +705,7 @@
               <w:rPr>
                 <w:sz w:val="18"/>
               </w:rPr>
-              <w:t>Opzione Estensione Garanzia Storage: 3 Anni ON-SITE con formula NBD (Next Business Day)  [OPZIONE]</w:t>
+              <w:t>Installazione fisica, cablaggio ridondante 100GbE QSFP28, setup VSA JovianDSS e tuning VMware ESXi</w:t>
             </w:r>
           </w:p>
         </w:tc>
@@ -1034,7 +731,7 @@
               <w:rPr>
                 <w:sz w:val="18"/>
               </w:rPr>
-              <w:t>€ 9907.25</w:t>
+              <w:t>€ 2502.50</w:t>
             </w:r>
           </w:p>
         </w:tc>
@@ -1047,7 +744,7 @@
               <w:rPr>
                 <w:sz w:val="18"/>
               </w:rPr>
-              <w:t>€ 9907.25</w:t>
+              <w:t>€ 2502.50</w:t>
             </w:r>
           </w:p>
         </w:tc>

</xml_diff>

<commit_message>
feat: institutionalize native visual analysis (pixel-to-markdown) and OKF v0.2 document intelligence protocol
</commit_message>
<xml_diff>
--- a/clients/teatek-spa/quotes/prev-2026-001.docx
+++ b/clients/teatek-spa/quotes/prev-2026-001.docx
@@ -205,7 +205,7 @@
               <w:rPr>
                 <w:sz w:val="18"/>
               </w:rPr>
-              <w:t>2U ZFS OpenStor JovianDSS Rack Storage (iSCSI/NFS/SMB/FC) 24 Bay 2.5" NVMe - DUAL INTEL XEON 6 -</w:t>
+              <w:t>2U ZFS OpenStor JovianDSS Rack Storage (iSCSI/NFS/SMB/FC) 24 Bay 2.5" NVMe - DUAL INTEL XEON 6 - 2x100GbE QSFP28 for metrocluster - 2*1GbE - 2000W Redundant PSU Titanium Level</w:t>
             </w:r>
           </w:p>
         </w:tc>
@@ -218,7 +218,7 @@
               <w:rPr>
                 <w:sz w:val="18"/>
               </w:rPr>
-              <w:t>2</w:t>
+              <w:t>2.0</w:t>
             </w:r>
           </w:p>
         </w:tc>
@@ -272,7 +272,7 @@
               <w:rPr>
                 <w:sz w:val="18"/>
               </w:rPr>
-              <w:t>CPU / SERVER - 6507P- (Xeon® 8C/16T) - min 3,50GHz -max 4,30GHz - 48M Cache - LGA4710 - TDP: 150W - MAX memoria 4TB</w:t>
+              <w:t>Intel Xeon 6507P (8C/16T, base 3,50GHz - turbo 4,30GHz, 48MB Cache, LGA4710, TDP 150W, 88 PCIe lanes)</w:t>
             </w:r>
           </w:p>
         </w:tc>
@@ -285,7 +285,7 @@
               <w:rPr>
                 <w:sz w:val="18"/>
               </w:rPr>
-              <w:t>4</w:t>
+              <w:t>4.0</w:t>
             </w:r>
           </w:p>
         </w:tc>
@@ -339,7 +339,7 @@
               <w:rPr>
                 <w:sz w:val="18"/>
               </w:rPr>
-              <w:t>Memoria 32GB DDR5-5600 ECC REG</w:t>
+              <w:t>32GB DDR5-5600 ECC Registered</w:t>
             </w:r>
           </w:p>
         </w:tc>
@@ -352,7 +352,7 @@
               <w:rPr>
                 <w:sz w:val="18"/>
               </w:rPr>
-              <w:t>16</w:t>
+              <w:t>16.0</w:t>
             </w:r>
           </w:p>
         </w:tc>
@@ -406,7 +406,7 @@
               <w:rPr>
                 <w:sz w:val="18"/>
               </w:rPr>
-              <w:t>Kioxia CM7-V U.3 15mm 3200 GB. SIE 3 DWPD PCIe Gen5 1x4, 2x2 Mix Use - Max KIOPs: 2.700K/600K</w:t>
+              <w:t>Kioxia CM7-V U.3 15mm 3.200 GB SIE 3 DWPD PCIe Gen5 1x4 (ZIL Write Log, fino a 2.700K IOPS)</w:t>
             </w:r>
           </w:p>
         </w:tc>
@@ -419,7 +419,7 @@
               <w:rPr>
                 <w:sz w:val="18"/>
               </w:rPr>
-              <w:t>2</w:t>
+              <w:t>2.0</w:t>
             </w:r>
           </w:p>
         </w:tc>
@@ -473,7 +473,7 @@
               <w:rPr>
                 <w:sz w:val="18"/>
               </w:rPr>
-              <w:t>Samsung PM9A3 3.8TB NVMe PCIe4x4 U.2 7mm 1DWPD 5YR SED Opal, Max KIOPs: 1000K/180K (Read/Write),</w:t>
+              <w:t>Samsung PM9A3 3.8TB NVMe PCIe 4.0 x4 U.2 7mm 1 DWPD SED Opal (fino a 1.000K IOPS)</w:t>
             </w:r>
           </w:p>
         </w:tc>
@@ -486,7 +486,7 @@
               <w:rPr>
                 <w:sz w:val="18"/>
               </w:rPr>
-              <w:t>20</w:t>
+              <w:t>20.0</w:t>
             </w:r>
           </w:p>
         </w:tc>
@@ -638,7 +638,7 @@
               <w:rPr>
                 <w:sz w:val="18"/>
               </w:rPr>
-              <w:t>Estensione a 3 / 5 anni ON-SITE opzionale  [OPZIONE]</w:t>
+              <w:t>Estensione Garanzia a 3 Anni ON-SITE con supporto sistemistico certificato</w:t>
             </w:r>
           </w:p>
         </w:tc>
@@ -651,7 +651,7 @@
               <w:rPr>
                 <w:sz w:val="18"/>
               </w:rPr>
-              <w:t>1</w:t>
+              <w:t>1.0</w:t>
             </w:r>
           </w:p>
         </w:tc>

</xml_diff>